<commit_message>
Update  Phase 3 document formatting
</commit_message>
<xml_diff>
--- a/Phase 3 - Project Design/Phase 3 - Project Design.docx
+++ b/Phase 3 - Project Design/Phase 3 - Project Design.docx
@@ -6,14 +6,20 @@
       <w:pPr>
         <w:jc w:val="center"/>
         <w:rPr>
+          <w:rFonts w:ascii="Times New Roman" w:hAnsi="Times New Roman" w:cs="Times New Roman"/>
           <w:b/>
           <w:bCs/>
-        </w:rPr>
-      </w:pPr>
-      <w:r>
-        <w:rPr>
+          <w:sz w:val="32"/>
+          <w:szCs w:val="32"/>
+        </w:rPr>
+      </w:pPr>
+      <w:r>
+        <w:rPr>
+          <w:rFonts w:ascii="Times New Roman" w:hAnsi="Times New Roman" w:cs="Times New Roman"/>
           <w:b/>
           <w:bCs/>
+          <w:sz w:val="32"/>
+          <w:szCs w:val="32"/>
         </w:rPr>
         <w:t>Phase 3 – Project Design</w:t>
       </w:r>
@@ -21,11 +27,19 @@
     <w:p>
       <w:pPr>
         <w:jc w:val="center"/>
-      </w:pPr>
-      <w:r>
-        <w:rPr>
+        <w:rPr>
+          <w:rFonts w:ascii="Times New Roman" w:hAnsi="Times New Roman" w:cs="Times New Roman"/>
+          <w:sz w:val="32"/>
+          <w:szCs w:val="32"/>
+        </w:rPr>
+      </w:pPr>
+      <w:r>
+        <w:rPr>
+          <w:rFonts w:ascii="Times New Roman" w:hAnsi="Times New Roman" w:cs="Times New Roman"/>
           <w:b/>
           <w:bCs/>
+          <w:sz w:val="32"/>
+          <w:szCs w:val="32"/>
         </w:rPr>
         <w:t>Script-Controlled ACL – Restrict Record Access Based on Field Value</w:t>
       </w:r>
@@ -33,27 +47,47 @@
     <w:p>
       <w:pPr>
         <w:rPr>
+          <w:rFonts w:ascii="Times New Roman" w:hAnsi="Times New Roman" w:cs="Times New Roman"/>
           <w:b/>
           <w:bCs/>
-        </w:rPr>
-      </w:pPr>
-      <w:r>
-        <w:rPr>
+          <w:sz w:val="28"/>
+          <w:szCs w:val="28"/>
+        </w:rPr>
+      </w:pPr>
+      <w:r>
+        <w:rPr>
+          <w:rFonts w:ascii="Times New Roman" w:hAnsi="Times New Roman" w:cs="Times New Roman"/>
           <w:b/>
           <w:bCs/>
+          <w:sz w:val="28"/>
+          <w:szCs w:val="28"/>
         </w:rPr>
         <w:t>1. System Design</w:t>
       </w:r>
     </w:p>
     <w:p>
-      <w:r>
+      <w:pPr>
+        <w:rPr>
+          <w:rFonts w:ascii="Times New Roman" w:hAnsi="Times New Roman" w:cs="Times New Roman"/>
+        </w:rPr>
+      </w:pPr>
+      <w:r>
+        <w:rPr>
+          <w:rFonts w:ascii="Times New Roman" w:hAnsi="Times New Roman" w:cs="Times New Roman"/>
+        </w:rPr>
         <w:t>The project is designed using a custom ServiceNow table called:</w:t>
       </w:r>
     </w:p>
     <w:p>
+      <w:pPr>
+        <w:rPr>
+          <w:rFonts w:ascii="Times New Roman" w:hAnsi="Times New Roman" w:cs="Times New Roman"/>
+        </w:rPr>
+      </w:pPr>
       <w:proofErr w:type="spellStart"/>
       <w:r>
         <w:rPr>
+          <w:rFonts w:ascii="Times New Roman" w:hAnsi="Times New Roman" w:cs="Times New Roman"/>
           <w:b/>
           <w:bCs/>
         </w:rPr>
@@ -62,27 +96,49 @@
       <w:proofErr w:type="spellEnd"/>
     </w:p>
     <w:p>
-      <w:r>
+      <w:pPr>
+        <w:rPr>
+          <w:rFonts w:ascii="Times New Roman" w:hAnsi="Times New Roman" w:cs="Times New Roman"/>
+        </w:rPr>
+      </w:pPr>
+      <w:r>
+        <w:rPr>
+          <w:rFonts w:ascii="Times New Roman" w:hAnsi="Times New Roman" w:cs="Times New Roman"/>
+        </w:rPr>
         <w:t>The table stores institution/student-related information.</w:t>
       </w:r>
     </w:p>
     <w:p>
       <w:pPr>
         <w:rPr>
+          <w:rFonts w:ascii="Times New Roman" w:hAnsi="Times New Roman" w:cs="Times New Roman"/>
           <w:b/>
           <w:bCs/>
-        </w:rPr>
-      </w:pPr>
-      <w:r>
-        <w:rPr>
+          <w:sz w:val="28"/>
+          <w:szCs w:val="28"/>
+        </w:rPr>
+      </w:pPr>
+      <w:r>
+        <w:rPr>
+          <w:rFonts w:ascii="Times New Roman" w:hAnsi="Times New Roman" w:cs="Times New Roman"/>
           <w:b/>
           <w:bCs/>
+          <w:sz w:val="28"/>
+          <w:szCs w:val="28"/>
         </w:rPr>
         <w:t>2. Table Design</w:t>
       </w:r>
     </w:p>
     <w:p>
-      <w:r>
+      <w:pPr>
+        <w:rPr>
+          <w:rFonts w:ascii="Times New Roman" w:hAnsi="Times New Roman" w:cs="Times New Roman"/>
+        </w:rPr>
+      </w:pPr>
+      <w:r>
+        <w:rPr>
+          <w:rFonts w:ascii="Times New Roman" w:hAnsi="Times New Roman" w:cs="Times New Roman"/>
+        </w:rPr>
         <w:t>The Institution Details table contains:</w:t>
       </w:r>
     </w:p>
@@ -92,8 +148,14 @@
           <w:ilvl w:val="0"/>
           <w:numId w:val="1"/>
         </w:numPr>
-      </w:pPr>
-      <w:r>
+        <w:rPr>
+          <w:rFonts w:ascii="Times New Roman" w:hAnsi="Times New Roman" w:cs="Times New Roman"/>
+        </w:rPr>
+      </w:pPr>
+      <w:r>
+        <w:rPr>
+          <w:rFonts w:ascii="Times New Roman" w:hAnsi="Times New Roman" w:cs="Times New Roman"/>
+        </w:rPr>
         <w:t>Student Roll Number</w:t>
       </w:r>
     </w:p>
@@ -103,8 +165,14 @@
           <w:ilvl w:val="0"/>
           <w:numId w:val="1"/>
         </w:numPr>
-      </w:pPr>
-      <w:r>
+        <w:rPr>
+          <w:rFonts w:ascii="Times New Roman" w:hAnsi="Times New Roman" w:cs="Times New Roman"/>
+        </w:rPr>
+      </w:pPr>
+      <w:r>
+        <w:rPr>
+          <w:rFonts w:ascii="Times New Roman" w:hAnsi="Times New Roman" w:cs="Times New Roman"/>
+        </w:rPr>
         <w:t>Student Name</w:t>
       </w:r>
     </w:p>
@@ -114,8 +182,14 @@
           <w:ilvl w:val="0"/>
           <w:numId w:val="1"/>
         </w:numPr>
-      </w:pPr>
-      <w:r>
+        <w:rPr>
+          <w:rFonts w:ascii="Times New Roman" w:hAnsi="Times New Roman" w:cs="Times New Roman"/>
+        </w:rPr>
+      </w:pPr>
+      <w:r>
+        <w:rPr>
+          <w:rFonts w:ascii="Times New Roman" w:hAnsi="Times New Roman" w:cs="Times New Roman"/>
+        </w:rPr>
         <w:t>Faculty Name</w:t>
       </w:r>
     </w:p>
@@ -125,8 +199,14 @@
           <w:ilvl w:val="0"/>
           <w:numId w:val="1"/>
         </w:numPr>
-      </w:pPr>
-      <w:r>
+        <w:rPr>
+          <w:rFonts w:ascii="Times New Roman" w:hAnsi="Times New Roman" w:cs="Times New Roman"/>
+        </w:rPr>
+      </w:pPr>
+      <w:r>
+        <w:rPr>
+          <w:rFonts w:ascii="Times New Roman" w:hAnsi="Times New Roman" w:cs="Times New Roman"/>
+        </w:rPr>
         <w:t>Branch</w:t>
       </w:r>
     </w:p>
@@ -136,8 +216,14 @@
           <w:ilvl w:val="0"/>
           <w:numId w:val="1"/>
         </w:numPr>
-      </w:pPr>
-      <w:r>
+        <w:rPr>
+          <w:rFonts w:ascii="Times New Roman" w:hAnsi="Times New Roman" w:cs="Times New Roman"/>
+        </w:rPr>
+      </w:pPr>
+      <w:r>
+        <w:rPr>
+          <w:rFonts w:ascii="Times New Roman" w:hAnsi="Times New Roman" w:cs="Times New Roman"/>
+        </w:rPr>
         <w:t>Email</w:t>
       </w:r>
     </w:p>
@@ -147,8 +233,14 @@
           <w:ilvl w:val="0"/>
           <w:numId w:val="1"/>
         </w:numPr>
-      </w:pPr>
-      <w:r>
+        <w:rPr>
+          <w:rFonts w:ascii="Times New Roman" w:hAnsi="Times New Roman" w:cs="Times New Roman"/>
+        </w:rPr>
+      </w:pPr>
+      <w:r>
+        <w:rPr>
+          <w:rFonts w:ascii="Times New Roman" w:hAnsi="Times New Roman" w:cs="Times New Roman"/>
+        </w:rPr>
         <w:t>Phone Number</w:t>
       </w:r>
     </w:p>
@@ -158,33 +250,61 @@
           <w:ilvl w:val="0"/>
           <w:numId w:val="1"/>
         </w:numPr>
-      </w:pPr>
-      <w:r>
+        <w:rPr>
+          <w:rFonts w:ascii="Times New Roman" w:hAnsi="Times New Roman" w:cs="Times New Roman"/>
+        </w:rPr>
+      </w:pPr>
+      <w:r>
+        <w:rPr>
+          <w:rFonts w:ascii="Times New Roman" w:hAnsi="Times New Roman" w:cs="Times New Roman"/>
+        </w:rPr>
         <w:t>Description</w:t>
       </w:r>
     </w:p>
     <w:p>
       <w:pPr>
         <w:rPr>
+          <w:rFonts w:ascii="Times New Roman" w:hAnsi="Times New Roman" w:cs="Times New Roman"/>
           <w:b/>
           <w:bCs/>
-        </w:rPr>
-      </w:pPr>
-      <w:r>
-        <w:rPr>
+          <w:sz w:val="28"/>
+          <w:szCs w:val="28"/>
+        </w:rPr>
+      </w:pPr>
+      <w:r>
+        <w:rPr>
+          <w:rFonts w:ascii="Times New Roman" w:hAnsi="Times New Roman" w:cs="Times New Roman"/>
           <w:b/>
           <w:bCs/>
+          <w:sz w:val="28"/>
+          <w:szCs w:val="28"/>
         </w:rPr>
         <w:t>3. Branch Design</w:t>
       </w:r>
     </w:p>
     <w:p>
-      <w:r>
+      <w:pPr>
+        <w:rPr>
+          <w:rFonts w:ascii="Times New Roman" w:hAnsi="Times New Roman" w:cs="Times New Roman"/>
+        </w:rPr>
+      </w:pPr>
+      <w:r>
+        <w:rPr>
+          <w:rFonts w:ascii="Times New Roman" w:hAnsi="Times New Roman" w:cs="Times New Roman"/>
+        </w:rPr>
         <w:t>The Branch field is designed as a Choice field.</w:t>
       </w:r>
     </w:p>
     <w:p>
-      <w:r>
+      <w:pPr>
+        <w:rPr>
+          <w:rFonts w:ascii="Times New Roman" w:hAnsi="Times New Roman" w:cs="Times New Roman"/>
+        </w:rPr>
+      </w:pPr>
+      <w:r>
+        <w:rPr>
+          <w:rFonts w:ascii="Times New Roman" w:hAnsi="Times New Roman" w:cs="Times New Roman"/>
+        </w:rPr>
         <w:t>Available choices:</w:t>
       </w:r>
     </w:p>
@@ -194,8 +314,14 @@
           <w:ilvl w:val="0"/>
           <w:numId w:val="2"/>
         </w:numPr>
-      </w:pPr>
-      <w:r>
+        <w:rPr>
+          <w:rFonts w:ascii="Times New Roman" w:hAnsi="Times New Roman" w:cs="Times New Roman"/>
+        </w:rPr>
+      </w:pPr>
+      <w:r>
+        <w:rPr>
+          <w:rFonts w:ascii="Times New Roman" w:hAnsi="Times New Roman" w:cs="Times New Roman"/>
+        </w:rPr>
         <w:t>ECE</w:t>
       </w:r>
     </w:p>
@@ -205,8 +331,14 @@
           <w:ilvl w:val="0"/>
           <w:numId w:val="2"/>
         </w:numPr>
-      </w:pPr>
-      <w:r>
+        <w:rPr>
+          <w:rFonts w:ascii="Times New Roman" w:hAnsi="Times New Roman" w:cs="Times New Roman"/>
+        </w:rPr>
+      </w:pPr>
+      <w:r>
+        <w:rPr>
+          <w:rFonts w:ascii="Times New Roman" w:hAnsi="Times New Roman" w:cs="Times New Roman"/>
+        </w:rPr>
         <w:t>EEE</w:t>
       </w:r>
     </w:p>
@@ -216,125 +348,214 @@
           <w:ilvl w:val="0"/>
           <w:numId w:val="2"/>
         </w:numPr>
-      </w:pPr>
-      <w:r>
+        <w:rPr>
+          <w:rFonts w:ascii="Times New Roman" w:hAnsi="Times New Roman" w:cs="Times New Roman"/>
+        </w:rPr>
+      </w:pPr>
+      <w:r>
+        <w:rPr>
+          <w:rFonts w:ascii="Times New Roman" w:hAnsi="Times New Roman" w:cs="Times New Roman"/>
+        </w:rPr>
         <w:t>CSE</w:t>
       </w:r>
     </w:p>
     <w:p>
       <w:pPr>
         <w:rPr>
+          <w:rFonts w:ascii="Times New Roman" w:hAnsi="Times New Roman" w:cs="Times New Roman"/>
           <w:b/>
           <w:bCs/>
-        </w:rPr>
-      </w:pPr>
-      <w:r>
-        <w:rPr>
+          <w:sz w:val="28"/>
+          <w:szCs w:val="28"/>
+        </w:rPr>
+      </w:pPr>
+      <w:r>
+        <w:rPr>
+          <w:rFonts w:ascii="Times New Roman" w:hAnsi="Times New Roman" w:cs="Times New Roman"/>
           <w:b/>
           <w:bCs/>
+          <w:sz w:val="28"/>
+          <w:szCs w:val="28"/>
         </w:rPr>
         <w:t>4. Role Design</w:t>
       </w:r>
     </w:p>
     <w:p>
-      <w:r>
+      <w:pPr>
+        <w:rPr>
+          <w:rFonts w:ascii="Times New Roman" w:hAnsi="Times New Roman" w:cs="Times New Roman"/>
+        </w:rPr>
+      </w:pPr>
+      <w:r>
+        <w:rPr>
+          <w:rFonts w:ascii="Times New Roman" w:hAnsi="Times New Roman" w:cs="Times New Roman"/>
+        </w:rPr>
         <w:t>Four custom roles are used for access control:</w:t>
       </w:r>
     </w:p>
     <w:p>
-      <w:r>
-        <w:rPr>
+      <w:pPr>
+        <w:rPr>
+          <w:rFonts w:ascii="Times New Roman" w:hAnsi="Times New Roman" w:cs="Times New Roman"/>
+        </w:rPr>
+      </w:pPr>
+      <w:r>
+        <w:rPr>
+          <w:rFonts w:ascii="Times New Roman" w:hAnsi="Times New Roman" w:cs="Times New Roman"/>
           <w:b/>
           <w:bCs/>
         </w:rPr>
         <w:t>bb1</w:t>
       </w:r>
       <w:r>
+        <w:rPr>
+          <w:rFonts w:ascii="Times New Roman" w:hAnsi="Times New Roman" w:cs="Times New Roman"/>
+        </w:rPr>
         <w:t xml:space="preserve"> – READ</w:t>
       </w:r>
       <w:r>
+        <w:rPr>
+          <w:rFonts w:ascii="Times New Roman" w:hAnsi="Times New Roman" w:cs="Times New Roman"/>
+        </w:rPr>
         <w:br/>
       </w:r>
       <w:r>
         <w:rPr>
+          <w:rFonts w:ascii="Times New Roman" w:hAnsi="Times New Roman" w:cs="Times New Roman"/>
           <w:b/>
           <w:bCs/>
         </w:rPr>
         <w:t>bb2</w:t>
       </w:r>
       <w:r>
+        <w:rPr>
+          <w:rFonts w:ascii="Times New Roman" w:hAnsi="Times New Roman" w:cs="Times New Roman"/>
+        </w:rPr>
         <w:t xml:space="preserve"> – CREATE</w:t>
       </w:r>
       <w:r>
+        <w:rPr>
+          <w:rFonts w:ascii="Times New Roman" w:hAnsi="Times New Roman" w:cs="Times New Roman"/>
+        </w:rPr>
         <w:br/>
       </w:r>
       <w:r>
         <w:rPr>
+          <w:rFonts w:ascii="Times New Roman" w:hAnsi="Times New Roman" w:cs="Times New Roman"/>
           <w:b/>
           <w:bCs/>
         </w:rPr>
         <w:t>bb3</w:t>
       </w:r>
       <w:r>
+        <w:rPr>
+          <w:rFonts w:ascii="Times New Roman" w:hAnsi="Times New Roman" w:cs="Times New Roman"/>
+        </w:rPr>
         <w:t xml:space="preserve"> – WRITE</w:t>
       </w:r>
       <w:r>
+        <w:rPr>
+          <w:rFonts w:ascii="Times New Roman" w:hAnsi="Times New Roman" w:cs="Times New Roman"/>
+        </w:rPr>
         <w:br/>
       </w:r>
       <w:r>
         <w:rPr>
+          <w:rFonts w:ascii="Times New Roman" w:hAnsi="Times New Roman" w:cs="Times New Roman"/>
           <w:b/>
           <w:bCs/>
         </w:rPr>
         <w:t>bb4</w:t>
       </w:r>
       <w:r>
+        <w:rPr>
+          <w:rFonts w:ascii="Times New Roman" w:hAnsi="Times New Roman" w:cs="Times New Roman"/>
+        </w:rPr>
         <w:t xml:space="preserve"> – DELETE</w:t>
       </w:r>
     </w:p>
     <w:p>
       <w:pPr>
         <w:rPr>
+          <w:rFonts w:ascii="Times New Roman" w:hAnsi="Times New Roman" w:cs="Times New Roman"/>
+        </w:rPr>
+      </w:pPr>
+    </w:p>
+    <w:p>
+      <w:pPr>
+        <w:rPr>
+          <w:rFonts w:ascii="Times New Roman" w:hAnsi="Times New Roman" w:cs="Times New Roman"/>
           <w:b/>
           <w:bCs/>
-        </w:rPr>
-      </w:pPr>
-      <w:r>
-        <w:rPr>
+          <w:sz w:val="28"/>
+          <w:szCs w:val="28"/>
+        </w:rPr>
+      </w:pPr>
+      <w:r>
+        <w:rPr>
+          <w:rFonts w:ascii="Times New Roman" w:hAnsi="Times New Roman" w:cs="Times New Roman"/>
           <w:b/>
           <w:bCs/>
-        </w:rPr>
+          <w:sz w:val="28"/>
+          <w:szCs w:val="28"/>
+        </w:rPr>
+        <w:lastRenderedPageBreak/>
         <w:t>5. ACL Design</w:t>
       </w:r>
     </w:p>
     <w:p>
-      <w:r>
+      <w:pPr>
+        <w:rPr>
+          <w:rFonts w:ascii="Times New Roman" w:hAnsi="Times New Roman" w:cs="Times New Roman"/>
+        </w:rPr>
+      </w:pPr>
+      <w:r>
+        <w:rPr>
+          <w:rFonts w:ascii="Times New Roman" w:hAnsi="Times New Roman" w:cs="Times New Roman"/>
+        </w:rPr>
         <w:t>The project contains four record-level ACLs.</w:t>
       </w:r>
     </w:p>
     <w:p>
       <w:pPr>
         <w:rPr>
+          <w:rFonts w:ascii="Times New Roman" w:hAnsi="Times New Roman" w:cs="Times New Roman"/>
           <w:b/>
           <w:bCs/>
         </w:rPr>
       </w:pPr>
       <w:r>
         <w:rPr>
+          <w:rFonts w:ascii="Times New Roman" w:hAnsi="Times New Roman" w:cs="Times New Roman"/>
           <w:b/>
           <w:bCs/>
         </w:rPr>
-        <w:lastRenderedPageBreak/>
         <w:t>READ ACL</w:t>
       </w:r>
     </w:p>
     <w:p>
-      <w:r>
+      <w:pPr>
+        <w:rPr>
+          <w:rFonts w:ascii="Times New Roman" w:hAnsi="Times New Roman" w:cs="Times New Roman"/>
+        </w:rPr>
+      </w:pPr>
+      <w:r>
+        <w:rPr>
+          <w:rFonts w:ascii="Times New Roman" w:hAnsi="Times New Roman" w:cs="Times New Roman"/>
+        </w:rPr>
         <w:t>The READ ACL controls whether the user can view records.</w:t>
       </w:r>
     </w:p>
     <w:p>
-      <w:r>
+      <w:pPr>
+        <w:rPr>
+          <w:rFonts w:ascii="Times New Roman" w:hAnsi="Times New Roman" w:cs="Times New Roman"/>
+        </w:rPr>
+      </w:pPr>
+      <w:r>
+        <w:rPr>
+          <w:rFonts w:ascii="Times New Roman" w:hAnsi="Times New Roman" w:cs="Times New Roman"/>
+        </w:rPr>
         <w:t>The ACL uses:</w:t>
       </w:r>
     </w:p>
@@ -344,8 +565,14 @@
           <w:ilvl w:val="0"/>
           <w:numId w:val="3"/>
         </w:numPr>
-      </w:pPr>
-      <w:r>
+        <w:rPr>
+          <w:rFonts w:ascii="Times New Roman" w:hAnsi="Times New Roman" w:cs="Times New Roman"/>
+        </w:rPr>
+      </w:pPr>
+      <w:r>
+        <w:rPr>
+          <w:rFonts w:ascii="Times New Roman" w:hAnsi="Times New Roman" w:cs="Times New Roman"/>
+        </w:rPr>
         <w:t>Operation: read</w:t>
       </w:r>
     </w:p>
@@ -355,8 +582,14 @@
           <w:ilvl w:val="0"/>
           <w:numId w:val="3"/>
         </w:numPr>
-      </w:pPr>
-      <w:r>
+        <w:rPr>
+          <w:rFonts w:ascii="Times New Roman" w:hAnsi="Times New Roman" w:cs="Times New Roman"/>
+        </w:rPr>
+      </w:pPr>
+      <w:r>
+        <w:rPr>
+          <w:rFonts w:ascii="Times New Roman" w:hAnsi="Times New Roman" w:cs="Times New Roman"/>
+        </w:rPr>
         <w:t>Role: bb1</w:t>
       </w:r>
     </w:p>
@@ -366,8 +599,14 @@
           <w:ilvl w:val="0"/>
           <w:numId w:val="3"/>
         </w:numPr>
-      </w:pPr>
-      <w:r>
+        <w:rPr>
+          <w:rFonts w:ascii="Times New Roman" w:hAnsi="Times New Roman" w:cs="Times New Roman"/>
+        </w:rPr>
+      </w:pPr>
+      <w:r>
+        <w:rPr>
+          <w:rFonts w:ascii="Times New Roman" w:hAnsi="Times New Roman" w:cs="Times New Roman"/>
+        </w:rPr>
         <w:t>Data condition: Branch is EEE</w:t>
       </w:r>
     </w:p>
@@ -377,25 +616,41 @@
           <w:ilvl w:val="0"/>
           <w:numId w:val="3"/>
         </w:numPr>
-      </w:pPr>
-      <w:r>
+        <w:rPr>
+          <w:rFonts w:ascii="Times New Roman" w:hAnsi="Times New Roman" w:cs="Times New Roman"/>
+        </w:rPr>
+      </w:pPr>
+      <w:r>
+        <w:rPr>
+          <w:rFonts w:ascii="Times New Roman" w:hAnsi="Times New Roman" w:cs="Times New Roman"/>
+        </w:rPr>
         <w:t>Advanced: true</w:t>
       </w:r>
     </w:p>
     <w:p>
-      <w:r>
+      <w:pPr>
+        <w:rPr>
+          <w:rFonts w:ascii="Times New Roman" w:hAnsi="Times New Roman" w:cs="Times New Roman"/>
+        </w:rPr>
+      </w:pPr>
+      <w:r>
+        <w:rPr>
+          <w:rFonts w:ascii="Times New Roman" w:hAnsi="Times New Roman" w:cs="Times New Roman"/>
+        </w:rPr>
         <w:t>The script allows administrators full access and allows users with the bb1 role.</w:t>
       </w:r>
     </w:p>
     <w:p>
       <w:pPr>
         <w:rPr>
+          <w:rFonts w:ascii="Times New Roman" w:hAnsi="Times New Roman" w:cs="Times New Roman"/>
           <w:b/>
           <w:bCs/>
         </w:rPr>
       </w:pPr>
       <w:r>
         <w:rPr>
+          <w:rFonts w:ascii="Times New Roman" w:hAnsi="Times New Roman" w:cs="Times New Roman"/>
           <w:b/>
           <w:bCs/>
         </w:rPr>
@@ -403,7 +658,15 @@
       </w:r>
     </w:p>
     <w:p>
-      <w:r>
+      <w:pPr>
+        <w:rPr>
+          <w:rFonts w:ascii="Times New Roman" w:hAnsi="Times New Roman" w:cs="Times New Roman"/>
+        </w:rPr>
+      </w:pPr>
+      <w:r>
+        <w:rPr>
+          <w:rFonts w:ascii="Times New Roman" w:hAnsi="Times New Roman" w:cs="Times New Roman"/>
+        </w:rPr>
         <w:t>The CREATE ACL controls the creation of new records.</w:t>
       </w:r>
     </w:p>
@@ -413,8 +676,14 @@
           <w:ilvl w:val="0"/>
           <w:numId w:val="4"/>
         </w:numPr>
-      </w:pPr>
-      <w:r>
+        <w:rPr>
+          <w:rFonts w:ascii="Times New Roman" w:hAnsi="Times New Roman" w:cs="Times New Roman"/>
+        </w:rPr>
+      </w:pPr>
+      <w:r>
+        <w:rPr>
+          <w:rFonts w:ascii="Times New Roman" w:hAnsi="Times New Roman" w:cs="Times New Roman"/>
+        </w:rPr>
         <w:t>Operation: create</w:t>
       </w:r>
     </w:p>
@@ -424,20 +693,28 @@
           <w:ilvl w:val="0"/>
           <w:numId w:val="4"/>
         </w:numPr>
-      </w:pPr>
-      <w:r>
+        <w:rPr>
+          <w:rFonts w:ascii="Times New Roman" w:hAnsi="Times New Roman" w:cs="Times New Roman"/>
+        </w:rPr>
+      </w:pPr>
+      <w:r>
+        <w:rPr>
+          <w:rFonts w:ascii="Times New Roman" w:hAnsi="Times New Roman" w:cs="Times New Roman"/>
+        </w:rPr>
         <w:t>Role: bb2</w:t>
       </w:r>
     </w:p>
     <w:p>
       <w:pPr>
         <w:rPr>
+          <w:rFonts w:ascii="Times New Roman" w:hAnsi="Times New Roman" w:cs="Times New Roman"/>
           <w:b/>
           <w:bCs/>
         </w:rPr>
       </w:pPr>
       <w:r>
         <w:rPr>
+          <w:rFonts w:ascii="Times New Roman" w:hAnsi="Times New Roman" w:cs="Times New Roman"/>
           <w:b/>
           <w:bCs/>
         </w:rPr>
@@ -445,7 +722,15 @@
       </w:r>
     </w:p>
     <w:p>
-      <w:r>
+      <w:pPr>
+        <w:rPr>
+          <w:rFonts w:ascii="Times New Roman" w:hAnsi="Times New Roman" w:cs="Times New Roman"/>
+        </w:rPr>
+      </w:pPr>
+      <w:r>
+        <w:rPr>
+          <w:rFonts w:ascii="Times New Roman" w:hAnsi="Times New Roman" w:cs="Times New Roman"/>
+        </w:rPr>
         <w:t>The WRITE ACL controls modification of records.</w:t>
       </w:r>
     </w:p>
@@ -455,8 +740,14 @@
           <w:ilvl w:val="0"/>
           <w:numId w:val="5"/>
         </w:numPr>
-      </w:pPr>
-      <w:r>
+        <w:rPr>
+          <w:rFonts w:ascii="Times New Roman" w:hAnsi="Times New Roman" w:cs="Times New Roman"/>
+        </w:rPr>
+      </w:pPr>
+      <w:r>
+        <w:rPr>
+          <w:rFonts w:ascii="Times New Roman" w:hAnsi="Times New Roman" w:cs="Times New Roman"/>
+        </w:rPr>
         <w:t>Operation: Write</w:t>
       </w:r>
     </w:p>
@@ -466,20 +757,28 @@
           <w:ilvl w:val="0"/>
           <w:numId w:val="5"/>
         </w:numPr>
-      </w:pPr>
-      <w:r>
+        <w:rPr>
+          <w:rFonts w:ascii="Times New Roman" w:hAnsi="Times New Roman" w:cs="Times New Roman"/>
+        </w:rPr>
+      </w:pPr>
+      <w:r>
+        <w:rPr>
+          <w:rFonts w:ascii="Times New Roman" w:hAnsi="Times New Roman" w:cs="Times New Roman"/>
+        </w:rPr>
         <w:t>Role: bb3</w:t>
       </w:r>
     </w:p>
     <w:p>
       <w:pPr>
         <w:rPr>
+          <w:rFonts w:ascii="Times New Roman" w:hAnsi="Times New Roman" w:cs="Times New Roman"/>
           <w:b/>
           <w:bCs/>
         </w:rPr>
       </w:pPr>
       <w:r>
         <w:rPr>
+          <w:rFonts w:ascii="Times New Roman" w:hAnsi="Times New Roman" w:cs="Times New Roman"/>
           <w:b/>
           <w:bCs/>
         </w:rPr>
@@ -487,7 +786,15 @@
       </w:r>
     </w:p>
     <w:p>
-      <w:r>
+      <w:pPr>
+        <w:rPr>
+          <w:rFonts w:ascii="Times New Roman" w:hAnsi="Times New Roman" w:cs="Times New Roman"/>
+        </w:rPr>
+      </w:pPr>
+      <w:r>
+        <w:rPr>
+          <w:rFonts w:ascii="Times New Roman" w:hAnsi="Times New Roman" w:cs="Times New Roman"/>
+        </w:rPr>
         <w:t>The DELETE ACL controls deletion of records.</w:t>
       </w:r>
     </w:p>
@@ -497,8 +804,14 @@
           <w:ilvl w:val="0"/>
           <w:numId w:val="6"/>
         </w:numPr>
-      </w:pPr>
-      <w:r>
+        <w:rPr>
+          <w:rFonts w:ascii="Times New Roman" w:hAnsi="Times New Roman" w:cs="Times New Roman"/>
+        </w:rPr>
+      </w:pPr>
+      <w:r>
+        <w:rPr>
+          <w:rFonts w:ascii="Times New Roman" w:hAnsi="Times New Roman" w:cs="Times New Roman"/>
+        </w:rPr>
         <w:t>Operation: Delete</w:t>
       </w:r>
     </w:p>
@@ -508,29 +821,47 @@
           <w:ilvl w:val="0"/>
           <w:numId w:val="6"/>
         </w:numPr>
-      </w:pPr>
-      <w:r>
+        <w:rPr>
+          <w:rFonts w:ascii="Times New Roman" w:hAnsi="Times New Roman" w:cs="Times New Roman"/>
+        </w:rPr>
+      </w:pPr>
+      <w:r>
+        <w:rPr>
+          <w:rFonts w:ascii="Times New Roman" w:hAnsi="Times New Roman" w:cs="Times New Roman"/>
+        </w:rPr>
         <w:t>Role: bb4</w:t>
       </w:r>
     </w:p>
     <w:p>
       <w:pPr>
         <w:rPr>
+          <w:rFonts w:ascii="Times New Roman" w:hAnsi="Times New Roman" w:cs="Times New Roman"/>
           <w:b/>
           <w:bCs/>
-        </w:rPr>
-      </w:pPr>
-      <w:r>
-        <w:rPr>
+          <w:sz w:val="28"/>
+          <w:szCs w:val="28"/>
+        </w:rPr>
+      </w:pPr>
+      <w:r>
+        <w:rPr>
+          <w:rFonts w:ascii="Times New Roman" w:hAnsi="Times New Roman" w:cs="Times New Roman"/>
           <w:b/>
           <w:bCs/>
+          <w:sz w:val="28"/>
+          <w:szCs w:val="28"/>
         </w:rPr>
         <w:t>6. Access Flow</w:t>
       </w:r>
     </w:p>
     <w:p>
-      <w:r>
-        <w:rPr>
+      <w:pPr>
+        <w:rPr>
+          <w:rFonts w:ascii="Times New Roman" w:hAnsi="Times New Roman" w:cs="Times New Roman"/>
+        </w:rPr>
+      </w:pPr>
+      <w:r>
+        <w:rPr>
+          <w:rFonts w:ascii="Times New Roman" w:hAnsi="Times New Roman" w:cs="Times New Roman"/>
           <w:b/>
           <w:bCs/>
         </w:rPr>
@@ -540,24 +871,44 @@
     <w:p>
       <w:pPr>
         <w:rPr>
+          <w:rFonts w:ascii="Times New Roman" w:hAnsi="Times New Roman" w:cs="Times New Roman"/>
           <w:b/>
           <w:bCs/>
-        </w:rPr>
-      </w:pPr>
-      <w:r>
-        <w:rPr>
+          <w:sz w:val="28"/>
+          <w:szCs w:val="28"/>
+        </w:rPr>
+      </w:pPr>
+      <w:r>
+        <w:rPr>
+          <w:rFonts w:ascii="Times New Roman" w:hAnsi="Times New Roman" w:cs="Times New Roman"/>
           <w:b/>
           <w:bCs/>
+          <w:sz w:val="28"/>
+          <w:szCs w:val="28"/>
         </w:rPr>
         <w:t>7. Expected Design</w:t>
       </w:r>
     </w:p>
     <w:p>
-      <w:r>
+      <w:pPr>
+        <w:rPr>
+          <w:rFonts w:ascii="Times New Roman" w:hAnsi="Times New Roman" w:cs="Times New Roman"/>
+        </w:rPr>
+      </w:pPr>
+      <w:r>
+        <w:rPr>
+          <w:rFonts w:ascii="Times New Roman" w:hAnsi="Times New Roman" w:cs="Times New Roman"/>
+        </w:rPr>
         <w:t>The design provides record-level security by combining user roles, ACL operations and field-based conditions.</w:t>
       </w:r>
     </w:p>
-    <w:p/>
+    <w:p>
+      <w:pPr>
+        <w:rPr>
+          <w:rFonts w:ascii="Times New Roman" w:hAnsi="Times New Roman" w:cs="Times New Roman"/>
+        </w:rPr>
+      </w:pPr>
+    </w:p>
     <w:sectPr>
       <w:pgSz w:w="11906" w:h="16838"/>
       <w:pgMar w:top="1440" w:right="1440" w:bottom="1440" w:left="1440" w:header="708" w:footer="708" w:gutter="0"/>
@@ -2088,6 +2439,7 @@
   <w:style w:type="character" w:default="1" w:styleId="DefaultParagraphFont">
     <w:name w:val="Default Paragraph Font"/>
     <w:uiPriority w:val="1"/>
+    <w:semiHidden/>
     <w:unhideWhenUsed/>
   </w:style>
   <w:style w:type="table" w:default="1" w:styleId="TableNormal">

</xml_diff>